<commit_message>
agr vai esse caralho
</commit_message>
<xml_diff>
--- a/Sistemas-Digitais/atividade_FSM_Datapath/At1fsm/Atividade1_FSM_Multiplicador.docx
+++ b/Sistemas-Digitais/atividade_FSM_Datapath/At1fsm/Atividade1_FSM_Multiplicador.docx
@@ -56,9 +56,6 @@
         <w:pStyle w:val="Normal"/>
         <w:spacing w:before="480" w:after="120"/>
         <w:jc w:val="center"/>
-        <w:rPr/>
-      </w:pPr>
-      <w:r>
         <w:rPr>
           <w:rFonts w:eastAsia="Arial" w:cs="Arial"/>
           <w:b/>
@@ -67,6 +64,45 @@
           <w:sz w:val="52"/>
           <w:szCs w:val="52"/>
         </w:rPr>
+      </w:pPr>
+      <w:r>
+        <w:rPr/>
+      </w:r>
+    </w:p>
+    <w:p>
+      <w:pPr>
+        <w:pStyle w:val="Normal"/>
+        <w:spacing w:before="480" w:after="120"/>
+        <w:jc w:val="center"/>
+        <w:rPr>
+          <w:rFonts w:eastAsia="Arial" w:cs="Arial"/>
+          <w:b/>
+          <w:bCs/>
+          <w:color w:val="1F4E79"/>
+          <w:sz w:val="52"/>
+          <w:szCs w:val="52"/>
+        </w:rPr>
+      </w:pPr>
+      <w:r>
+        <w:rPr/>
+      </w:r>
+    </w:p>
+    <w:p>
+      <w:pPr>
+        <w:pStyle w:val="Normal"/>
+        <w:spacing w:before="480" w:after="120"/>
+        <w:jc w:val="center"/>
+        <w:rPr/>
+      </w:pPr>
+      <w:r>
+        <w:rPr>
+          <w:rFonts w:eastAsia="Arial" w:cs="Arial"/>
+          <w:b/>
+          <w:bCs/>
+          <w:color w:val="1F4E79"/>
+          <w:sz w:val="52"/>
+          <w:szCs w:val="52"/>
+        </w:rPr>
         <w:t>Atividade 1</w:t>
       </w:r>
     </w:p>
@@ -104,6 +140,175 @@
           <w:szCs w:val="22"/>
         </w:rPr>
         <w:t>FSM + Datapath — Placa DE1 (Cyclone II EP2C20F484C7)</w:t>
+      </w:r>
+    </w:p>
+    <w:p>
+      <w:pPr>
+        <w:pStyle w:val="Normal"/>
+        <w:pBdr>
+          <w:bottom w:val="single" w:sz="4" w:space="1" w:color="2E75B6"/>
+        </w:pBdr>
+        <w:spacing w:before="120" w:after="120"/>
+        <w:rPr/>
+      </w:pPr>
+      <w:r>
+        <w:rPr/>
+      </w:r>
+    </w:p>
+    <w:p>
+      <w:pPr>
+        <w:pStyle w:val="Normal"/>
+        <w:pBdr>
+          <w:bottom w:val="single" w:sz="4" w:space="1" w:color="2E75B6"/>
+        </w:pBdr>
+        <w:spacing w:before="120" w:after="120"/>
+        <w:rPr/>
+      </w:pPr>
+      <w:r>
+        <w:rPr/>
+      </w:r>
+    </w:p>
+    <w:p>
+      <w:pPr>
+        <w:pStyle w:val="Normal"/>
+        <w:pBdr>
+          <w:bottom w:val="single" w:sz="4" w:space="1" w:color="2E75B6"/>
+        </w:pBdr>
+        <w:spacing w:before="120" w:after="120"/>
+        <w:rPr/>
+      </w:pPr>
+      <w:r>
+        <w:rPr/>
+      </w:r>
+    </w:p>
+    <w:p>
+      <w:pPr>
+        <w:pStyle w:val="Normal"/>
+        <w:pBdr>
+          <w:bottom w:val="single" w:sz="4" w:space="1" w:color="2E75B6"/>
+        </w:pBdr>
+        <w:spacing w:before="120" w:after="120"/>
+        <w:rPr/>
+      </w:pPr>
+      <w:r>
+        <w:rPr/>
+      </w:r>
+    </w:p>
+    <w:p>
+      <w:pPr>
+        <w:pStyle w:val="Normal"/>
+        <w:pBdr>
+          <w:bottom w:val="single" w:sz="4" w:space="1" w:color="2E75B6"/>
+        </w:pBdr>
+        <w:spacing w:before="120" w:after="120"/>
+        <w:rPr/>
+      </w:pPr>
+      <w:r>
+        <w:rPr/>
+      </w:r>
+    </w:p>
+    <w:p>
+      <w:pPr>
+        <w:pStyle w:val="Normal"/>
+        <w:pBdr>
+          <w:bottom w:val="single" w:sz="4" w:space="1" w:color="2E75B6"/>
+        </w:pBdr>
+        <w:spacing w:before="120" w:after="120"/>
+        <w:rPr/>
+      </w:pPr>
+      <w:r>
+        <w:rPr/>
+      </w:r>
+    </w:p>
+    <w:p>
+      <w:pPr>
+        <w:pStyle w:val="Normal"/>
+        <w:pBdr>
+          <w:bottom w:val="single" w:sz="4" w:space="1" w:color="2E75B6"/>
+        </w:pBdr>
+        <w:spacing w:before="120" w:after="120"/>
+        <w:rPr/>
+      </w:pPr>
+      <w:r>
+        <w:rPr/>
+      </w:r>
+    </w:p>
+    <w:p>
+      <w:pPr>
+        <w:pStyle w:val="Normal"/>
+        <w:pBdr>
+          <w:bottom w:val="single" w:sz="4" w:space="1" w:color="2E75B6"/>
+        </w:pBdr>
+        <w:spacing w:before="120" w:after="120"/>
+        <w:rPr/>
+      </w:pPr>
+      <w:r>
+        <w:rPr/>
+      </w:r>
+    </w:p>
+    <w:p>
+      <w:pPr>
+        <w:pStyle w:val="Normal"/>
+        <w:pBdr>
+          <w:bottom w:val="single" w:sz="4" w:space="1" w:color="2E75B6"/>
+        </w:pBdr>
+        <w:spacing w:before="120" w:after="120"/>
+        <w:rPr/>
+      </w:pPr>
+      <w:r>
+        <w:rPr/>
+      </w:r>
+    </w:p>
+    <w:p>
+      <w:pPr>
+        <w:pStyle w:val="Normal"/>
+        <w:pBdr>
+          <w:bottom w:val="single" w:sz="4" w:space="1" w:color="2E75B6"/>
+        </w:pBdr>
+        <w:spacing w:before="120" w:after="120"/>
+        <w:rPr/>
+      </w:pPr>
+      <w:r>
+        <w:rPr/>
+      </w:r>
+    </w:p>
+    <w:p>
+      <w:pPr>
+        <w:pStyle w:val="Normal"/>
+        <w:pBdr>
+          <w:bottom w:val="single" w:sz="4" w:space="1" w:color="2E75B6"/>
+        </w:pBdr>
+        <w:spacing w:before="120" w:after="120"/>
+        <w:rPr/>
+      </w:pPr>
+      <w:r>
+        <w:rPr/>
+      </w:r>
+    </w:p>
+    <w:p>
+      <w:pPr>
+        <w:pStyle w:val="Normal"/>
+        <w:pBdr>
+          <w:bottom w:val="single" w:sz="4" w:space="1" w:color="2E75B6"/>
+        </w:pBdr>
+        <w:spacing w:before="120" w:after="120"/>
+        <w:rPr/>
+      </w:pPr>
+      <w:r>
+        <w:rPr/>
+      </w:r>
+    </w:p>
+    <w:p>
+      <w:pPr>
+        <w:pStyle w:val="Normal"/>
+        <w:pBdr>
+          <w:bottom w:val="single" w:sz="4" w:space="1" w:color="2E75B6"/>
+        </w:pBdr>
+        <w:spacing w:before="120" w:after="120"/>
+        <w:rPr/>
+      </w:pPr>
+      <w:r>
+        <w:rPr/>
       </w:r>
     </w:p>
     <w:p>
@@ -3756,7 +3961,14 @@
         </w:rPr>
       </w:pPr>
       <w:r>
-        <w:rPr/>
+        <w:rPr>
+          <w:rFonts w:eastAsia="Arial" w:cs="Arial"/>
+          <w:b/>
+          <w:bCs/>
+          <w:color w:val="1F4E79"/>
+          <w:sz w:val="36"/>
+          <w:szCs w:val="36"/>
+        </w:rPr>
       </w:r>
     </w:p>
     <w:p>
@@ -3773,7 +3985,14 @@
         </w:rPr>
       </w:pPr>
       <w:r>
-        <w:rPr/>
+        <w:rPr>
+          <w:rFonts w:eastAsia="Arial" w:cs="Arial"/>
+          <w:b/>
+          <w:bCs/>
+          <w:color w:val="1F4E79"/>
+          <w:sz w:val="36"/>
+          <w:szCs w:val="36"/>
+        </w:rPr>
       </w:r>
     </w:p>
     <w:p>
@@ -3790,7 +4009,14 @@
         </w:rPr>
       </w:pPr>
       <w:r>
-        <w:rPr/>
+        <w:rPr>
+          <w:rFonts w:eastAsia="Arial" w:cs="Arial"/>
+          <w:b/>
+          <w:bCs/>
+          <w:color w:val="1F4E79"/>
+          <w:sz w:val="36"/>
+          <w:szCs w:val="36"/>
+        </w:rPr>
       </w:r>
     </w:p>
     <w:p>
@@ -3807,7 +4033,14 @@
         </w:rPr>
       </w:pPr>
       <w:r>
-        <w:rPr/>
+        <w:rPr>
+          <w:rFonts w:eastAsia="Arial" w:cs="Arial"/>
+          <w:b/>
+          <w:bCs/>
+          <w:color w:val="1F4E79"/>
+          <w:sz w:val="36"/>
+          <w:szCs w:val="36"/>
+        </w:rPr>
       </w:r>
     </w:p>
     <w:p>
@@ -3824,7 +4057,14 @@
         </w:rPr>
       </w:pPr>
       <w:r>
-        <w:rPr/>
+        <w:rPr>
+          <w:rFonts w:eastAsia="Arial" w:cs="Arial"/>
+          <w:b/>
+          <w:bCs/>
+          <w:color w:val="1F4E79"/>
+          <w:sz w:val="36"/>
+          <w:szCs w:val="36"/>
+        </w:rPr>
       </w:r>
     </w:p>
     <w:p>
@@ -3841,7 +4081,14 @@
         </w:rPr>
       </w:pPr>
       <w:r>
-        <w:rPr/>
+        <w:rPr>
+          <w:rFonts w:eastAsia="Arial" w:cs="Arial"/>
+          <w:b/>
+          <w:bCs/>
+          <w:color w:val="1F4E79"/>
+          <w:sz w:val="36"/>
+          <w:szCs w:val="36"/>
+        </w:rPr>
       </w:r>
     </w:p>
     <w:p>
@@ -3899,7 +4146,11 @@
         </w:rPr>
       </w:pPr>
       <w:r>
-        <w:rPr/>
+        <w:rPr>
+          <w:rFonts w:eastAsia="Courier New" w:cs="Courier New" w:ascii="Courier New" w:hAnsi="Courier New"/>
+          <w:sz w:val="18"/>
+          <w:szCs w:val="18"/>
+        </w:rPr>
         <w:drawing>
           <wp:anchor behindDoc="0" distT="0" distB="0" distL="0" distR="0" simplePos="0" locked="0" layoutInCell="0" allowOverlap="1" relativeHeight="2">
             <wp:simplePos x="0" y="0"/>
@@ -6520,21 +6771,21 @@
         </w:tblCellMar>
       </w:tblPr>
       <w:tblGrid>
-        <w:gridCol w:w="1448"/>
-        <w:gridCol w:w="847"/>
+        <w:gridCol w:w="1447"/>
+        <w:gridCol w:w="848"/>
         <w:gridCol w:w="845"/>
         <w:gridCol w:w="845"/>
         <w:gridCol w:w="845"/>
         <w:gridCol w:w="846"/>
         <w:gridCol w:w="846"/>
-        <w:gridCol w:w="845"/>
-        <w:gridCol w:w="1992"/>
+        <w:gridCol w:w="846"/>
+        <w:gridCol w:w="1991"/>
       </w:tblGrid>
       <w:tr>
         <w:trPr/>
         <w:tc>
           <w:tcPr>
-            <w:tcW w:w="1448" w:type="dxa"/>
+            <w:tcW w:w="1447" w:type="dxa"/>
             <w:tcBorders>
               <w:top w:val="single" w:sz="2" w:space="0" w:color="2E75B6"/>
               <w:left w:val="single" w:sz="2" w:space="0" w:color="2E75B6"/>
@@ -6565,7 +6816,7 @@
         </w:tc>
         <w:tc>
           <w:tcPr>
-            <w:tcW w:w="847" w:type="dxa"/>
+            <w:tcW w:w="848" w:type="dxa"/>
             <w:tcBorders>
               <w:top w:val="single" w:sz="2" w:space="0" w:color="2E75B6"/>
               <w:left w:val="single" w:sz="2" w:space="0" w:color="2E75B6"/>
@@ -6751,7 +7002,7 @@
         </w:tc>
         <w:tc>
           <w:tcPr>
-            <w:tcW w:w="845" w:type="dxa"/>
+            <w:tcW w:w="846" w:type="dxa"/>
             <w:tcBorders>
               <w:top w:val="single" w:sz="2" w:space="0" w:color="2E75B6"/>
               <w:left w:val="single" w:sz="2" w:space="0" w:color="2E75B6"/>
@@ -6782,7 +7033,7 @@
         </w:tc>
         <w:tc>
           <w:tcPr>
-            <w:tcW w:w="1992" w:type="dxa"/>
+            <w:tcW w:w="1991" w:type="dxa"/>
             <w:tcBorders>
               <w:top w:val="single" w:sz="2" w:space="0" w:color="2E75B6"/>
               <w:left w:val="single" w:sz="2" w:space="0" w:color="2E75B6"/>
@@ -6816,7 +7067,7 @@
         <w:trPr/>
         <w:tc>
           <w:tcPr>
-            <w:tcW w:w="1448" w:type="dxa"/>
+            <w:tcW w:w="1447" w:type="dxa"/>
             <w:tcBorders>
               <w:top w:val="single" w:sz="2" w:space="0" w:color="999999"/>
               <w:left w:val="single" w:sz="2" w:space="0" w:color="999999"/>
@@ -6847,7 +7098,7 @@
         </w:tc>
         <w:tc>
           <w:tcPr>
-            <w:tcW w:w="847" w:type="dxa"/>
+            <w:tcW w:w="848" w:type="dxa"/>
             <w:tcBorders>
               <w:top w:val="single" w:sz="2" w:space="0" w:color="999999"/>
               <w:left w:val="single" w:sz="2" w:space="0" w:color="999999"/>
@@ -7033,7 +7284,7 @@
         </w:tc>
         <w:tc>
           <w:tcPr>
-            <w:tcW w:w="845" w:type="dxa"/>
+            <w:tcW w:w="846" w:type="dxa"/>
             <w:tcBorders>
               <w:top w:val="single" w:sz="2" w:space="0" w:color="999999"/>
               <w:left w:val="single" w:sz="2" w:space="0" w:color="999999"/>
@@ -7064,7 +7315,7 @@
         </w:tc>
         <w:tc>
           <w:tcPr>
-            <w:tcW w:w="1992" w:type="dxa"/>
+            <w:tcW w:w="1991" w:type="dxa"/>
             <w:tcBorders>
               <w:top w:val="single" w:sz="2" w:space="0" w:color="999999"/>
               <w:left w:val="single" w:sz="2" w:space="0" w:color="999999"/>
@@ -7098,7 +7349,7 @@
         <w:trPr/>
         <w:tc>
           <w:tcPr>
-            <w:tcW w:w="1448" w:type="dxa"/>
+            <w:tcW w:w="1447" w:type="dxa"/>
             <w:tcBorders>
               <w:top w:val="single" w:sz="2" w:space="0" w:color="999999"/>
               <w:left w:val="single" w:sz="2" w:space="0" w:color="999999"/>
@@ -7129,7 +7380,7 @@
         </w:tc>
         <w:tc>
           <w:tcPr>
-            <w:tcW w:w="847" w:type="dxa"/>
+            <w:tcW w:w="848" w:type="dxa"/>
             <w:tcBorders>
               <w:top w:val="single" w:sz="2" w:space="0" w:color="999999"/>
               <w:left w:val="single" w:sz="2" w:space="0" w:color="999999"/>
@@ -7315,7 +7566,7 @@
         </w:tc>
         <w:tc>
           <w:tcPr>
-            <w:tcW w:w="845" w:type="dxa"/>
+            <w:tcW w:w="846" w:type="dxa"/>
             <w:tcBorders>
               <w:top w:val="single" w:sz="2" w:space="0" w:color="999999"/>
               <w:left w:val="single" w:sz="2" w:space="0" w:color="999999"/>
@@ -7346,7 +7597,7 @@
         </w:tc>
         <w:tc>
           <w:tcPr>
-            <w:tcW w:w="1992" w:type="dxa"/>
+            <w:tcW w:w="1991" w:type="dxa"/>
             <w:tcBorders>
               <w:top w:val="single" w:sz="2" w:space="0" w:color="999999"/>
               <w:left w:val="single" w:sz="2" w:space="0" w:color="999999"/>
@@ -7380,7 +7631,7 @@
         <w:trPr/>
         <w:tc>
           <w:tcPr>
-            <w:tcW w:w="1448" w:type="dxa"/>
+            <w:tcW w:w="1447" w:type="dxa"/>
             <w:tcBorders>
               <w:top w:val="single" w:sz="2" w:space="0" w:color="999999"/>
               <w:left w:val="single" w:sz="2" w:space="0" w:color="999999"/>
@@ -7411,7 +7662,7 @@
         </w:tc>
         <w:tc>
           <w:tcPr>
-            <w:tcW w:w="847" w:type="dxa"/>
+            <w:tcW w:w="848" w:type="dxa"/>
             <w:tcBorders>
               <w:top w:val="single" w:sz="2" w:space="0" w:color="999999"/>
               <w:left w:val="single" w:sz="2" w:space="0" w:color="999999"/>
@@ -7597,7 +7848,7 @@
         </w:tc>
         <w:tc>
           <w:tcPr>
-            <w:tcW w:w="845" w:type="dxa"/>
+            <w:tcW w:w="846" w:type="dxa"/>
             <w:tcBorders>
               <w:top w:val="single" w:sz="2" w:space="0" w:color="999999"/>
               <w:left w:val="single" w:sz="2" w:space="0" w:color="999999"/>
@@ -7628,7 +7879,7 @@
         </w:tc>
         <w:tc>
           <w:tcPr>
-            <w:tcW w:w="1992" w:type="dxa"/>
+            <w:tcW w:w="1991" w:type="dxa"/>
             <w:tcBorders>
               <w:top w:val="single" w:sz="2" w:space="0" w:color="999999"/>
               <w:left w:val="single" w:sz="2" w:space="0" w:color="999999"/>
@@ -7662,7 +7913,7 @@
         <w:trPr/>
         <w:tc>
           <w:tcPr>
-            <w:tcW w:w="1448" w:type="dxa"/>
+            <w:tcW w:w="1447" w:type="dxa"/>
             <w:tcBorders>
               <w:top w:val="single" w:sz="2" w:space="0" w:color="999999"/>
               <w:left w:val="single" w:sz="2" w:space="0" w:color="999999"/>
@@ -7693,7 +7944,7 @@
         </w:tc>
         <w:tc>
           <w:tcPr>
-            <w:tcW w:w="847" w:type="dxa"/>
+            <w:tcW w:w="848" w:type="dxa"/>
             <w:tcBorders>
               <w:top w:val="single" w:sz="2" w:space="0" w:color="999999"/>
               <w:left w:val="single" w:sz="2" w:space="0" w:color="999999"/>
@@ -7879,7 +8130,7 @@
         </w:tc>
         <w:tc>
           <w:tcPr>
-            <w:tcW w:w="845" w:type="dxa"/>
+            <w:tcW w:w="846" w:type="dxa"/>
             <w:tcBorders>
               <w:top w:val="single" w:sz="2" w:space="0" w:color="999999"/>
               <w:left w:val="single" w:sz="2" w:space="0" w:color="999999"/>
@@ -7910,7 +8161,7 @@
         </w:tc>
         <w:tc>
           <w:tcPr>
-            <w:tcW w:w="1992" w:type="dxa"/>
+            <w:tcW w:w="1991" w:type="dxa"/>
             <w:tcBorders>
               <w:top w:val="single" w:sz="2" w:space="0" w:color="999999"/>
               <w:left w:val="single" w:sz="2" w:space="0" w:color="999999"/>
@@ -7944,7 +8195,7 @@
         <w:trPr/>
         <w:tc>
           <w:tcPr>
-            <w:tcW w:w="1448" w:type="dxa"/>
+            <w:tcW w:w="1447" w:type="dxa"/>
             <w:tcBorders>
               <w:top w:val="single" w:sz="2" w:space="0" w:color="999999"/>
               <w:left w:val="single" w:sz="2" w:space="0" w:color="999999"/>
@@ -7975,7 +8226,7 @@
         </w:tc>
         <w:tc>
           <w:tcPr>
-            <w:tcW w:w="847" w:type="dxa"/>
+            <w:tcW w:w="848" w:type="dxa"/>
             <w:tcBorders>
               <w:top w:val="single" w:sz="2" w:space="0" w:color="999999"/>
               <w:left w:val="single" w:sz="2" w:space="0" w:color="999999"/>
@@ -8161,7 +8412,7 @@
         </w:tc>
         <w:tc>
           <w:tcPr>
-            <w:tcW w:w="845" w:type="dxa"/>
+            <w:tcW w:w="846" w:type="dxa"/>
             <w:tcBorders>
               <w:top w:val="single" w:sz="2" w:space="0" w:color="999999"/>
               <w:left w:val="single" w:sz="2" w:space="0" w:color="999999"/>
@@ -8192,7 +8443,7 @@
         </w:tc>
         <w:tc>
           <w:tcPr>
-            <w:tcW w:w="1992" w:type="dxa"/>
+            <w:tcW w:w="1991" w:type="dxa"/>
             <w:tcBorders>
               <w:top w:val="single" w:sz="2" w:space="0" w:color="999999"/>
               <w:left w:val="single" w:sz="2" w:space="0" w:color="999999"/>
@@ -8226,7 +8477,7 @@
         <w:trPr/>
         <w:tc>
           <w:tcPr>
-            <w:tcW w:w="1448" w:type="dxa"/>
+            <w:tcW w:w="1447" w:type="dxa"/>
             <w:tcBorders>
               <w:top w:val="single" w:sz="2" w:space="0" w:color="999999"/>
               <w:left w:val="single" w:sz="2" w:space="0" w:color="999999"/>
@@ -8257,7 +8508,7 @@
         </w:tc>
         <w:tc>
           <w:tcPr>
-            <w:tcW w:w="847" w:type="dxa"/>
+            <w:tcW w:w="848" w:type="dxa"/>
             <w:tcBorders>
               <w:top w:val="single" w:sz="2" w:space="0" w:color="999999"/>
               <w:left w:val="single" w:sz="2" w:space="0" w:color="999999"/>
@@ -8443,7 +8694,7 @@
         </w:tc>
         <w:tc>
           <w:tcPr>
-            <w:tcW w:w="845" w:type="dxa"/>
+            <w:tcW w:w="846" w:type="dxa"/>
             <w:tcBorders>
               <w:top w:val="single" w:sz="2" w:space="0" w:color="999999"/>
               <w:left w:val="single" w:sz="2" w:space="0" w:color="999999"/>
@@ -8474,7 +8725,7 @@
         </w:tc>
         <w:tc>
           <w:tcPr>
-            <w:tcW w:w="1992" w:type="dxa"/>
+            <w:tcW w:w="1991" w:type="dxa"/>
             <w:tcBorders>
               <w:top w:val="single" w:sz="2" w:space="0" w:color="999999"/>
               <w:left w:val="single" w:sz="2" w:space="0" w:color="999999"/>
@@ -8508,7 +8759,7 @@
         <w:trPr/>
         <w:tc>
           <w:tcPr>
-            <w:tcW w:w="1448" w:type="dxa"/>
+            <w:tcW w:w="1447" w:type="dxa"/>
             <w:tcBorders>
               <w:top w:val="single" w:sz="2" w:space="0" w:color="999999"/>
               <w:left w:val="single" w:sz="2" w:space="0" w:color="999999"/>
@@ -8539,7 +8790,7 @@
         </w:tc>
         <w:tc>
           <w:tcPr>
-            <w:tcW w:w="847" w:type="dxa"/>
+            <w:tcW w:w="848" w:type="dxa"/>
             <w:tcBorders>
               <w:top w:val="single" w:sz="2" w:space="0" w:color="999999"/>
               <w:left w:val="single" w:sz="2" w:space="0" w:color="999999"/>
@@ -8725,7 +8976,7 @@
         </w:tc>
         <w:tc>
           <w:tcPr>
-            <w:tcW w:w="845" w:type="dxa"/>
+            <w:tcW w:w="846" w:type="dxa"/>
             <w:tcBorders>
               <w:top w:val="single" w:sz="2" w:space="0" w:color="999999"/>
               <w:left w:val="single" w:sz="2" w:space="0" w:color="999999"/>
@@ -8756,7 +9007,7 @@
         </w:tc>
         <w:tc>
           <w:tcPr>
-            <w:tcW w:w="1992" w:type="dxa"/>
+            <w:tcW w:w="1991" w:type="dxa"/>
             <w:tcBorders>
               <w:top w:val="single" w:sz="2" w:space="0" w:color="999999"/>
               <w:left w:val="single" w:sz="2" w:space="0" w:color="999999"/>
@@ -8790,7 +9041,7 @@
         <w:trPr/>
         <w:tc>
           <w:tcPr>
-            <w:tcW w:w="1448" w:type="dxa"/>
+            <w:tcW w:w="1447" w:type="dxa"/>
             <w:tcBorders>
               <w:top w:val="single" w:sz="2" w:space="0" w:color="999999"/>
               <w:left w:val="single" w:sz="2" w:space="0" w:color="999999"/>
@@ -8821,7 +9072,7 @@
         </w:tc>
         <w:tc>
           <w:tcPr>
-            <w:tcW w:w="847" w:type="dxa"/>
+            <w:tcW w:w="848" w:type="dxa"/>
             <w:tcBorders>
               <w:top w:val="single" w:sz="2" w:space="0" w:color="999999"/>
               <w:left w:val="single" w:sz="2" w:space="0" w:color="999999"/>
@@ -9007,7 +9258,7 @@
         </w:tc>
         <w:tc>
           <w:tcPr>
-            <w:tcW w:w="845" w:type="dxa"/>
+            <w:tcW w:w="846" w:type="dxa"/>
             <w:tcBorders>
               <w:top w:val="single" w:sz="2" w:space="0" w:color="999999"/>
               <w:left w:val="single" w:sz="2" w:space="0" w:color="999999"/>
@@ -9038,7 +9289,7 @@
         </w:tc>
         <w:tc>
           <w:tcPr>
-            <w:tcW w:w="1992" w:type="dxa"/>
+            <w:tcW w:w="1991" w:type="dxa"/>
             <w:tcBorders>
               <w:top w:val="single" w:sz="2" w:space="0" w:color="999999"/>
               <w:left w:val="single" w:sz="2" w:space="0" w:color="999999"/>
@@ -9072,7 +9323,7 @@
         <w:trPr/>
         <w:tc>
           <w:tcPr>
-            <w:tcW w:w="1448" w:type="dxa"/>
+            <w:tcW w:w="1447" w:type="dxa"/>
             <w:tcBorders>
               <w:top w:val="single" w:sz="2" w:space="0" w:color="999999"/>
               <w:left w:val="single" w:sz="2" w:space="0" w:color="999999"/>
@@ -9103,7 +9354,7 @@
         </w:tc>
         <w:tc>
           <w:tcPr>
-            <w:tcW w:w="847" w:type="dxa"/>
+            <w:tcW w:w="848" w:type="dxa"/>
             <w:tcBorders>
               <w:top w:val="single" w:sz="2" w:space="0" w:color="999999"/>
               <w:left w:val="single" w:sz="2" w:space="0" w:color="999999"/>
@@ -9289,7 +9540,7 @@
         </w:tc>
         <w:tc>
           <w:tcPr>
-            <w:tcW w:w="845" w:type="dxa"/>
+            <w:tcW w:w="846" w:type="dxa"/>
             <w:tcBorders>
               <w:top w:val="single" w:sz="2" w:space="0" w:color="999999"/>
               <w:left w:val="single" w:sz="2" w:space="0" w:color="999999"/>
@@ -9320,7 +9571,7 @@
         </w:tc>
         <w:tc>
           <w:tcPr>
-            <w:tcW w:w="1992" w:type="dxa"/>
+            <w:tcW w:w="1991" w:type="dxa"/>
             <w:tcBorders>
               <w:top w:val="single" w:sz="2" w:space="0" w:color="999999"/>
               <w:left w:val="single" w:sz="2" w:space="0" w:color="999999"/>
@@ -9354,7 +9605,7 @@
         <w:trPr/>
         <w:tc>
           <w:tcPr>
-            <w:tcW w:w="1448" w:type="dxa"/>
+            <w:tcW w:w="1447" w:type="dxa"/>
             <w:tcBorders>
               <w:top w:val="single" w:sz="2" w:space="0" w:color="999999"/>
               <w:left w:val="single" w:sz="2" w:space="0" w:color="999999"/>
@@ -9385,7 +9636,7 @@
         </w:tc>
         <w:tc>
           <w:tcPr>
-            <w:tcW w:w="847" w:type="dxa"/>
+            <w:tcW w:w="848" w:type="dxa"/>
             <w:tcBorders>
               <w:top w:val="single" w:sz="2" w:space="0" w:color="999999"/>
               <w:left w:val="single" w:sz="2" w:space="0" w:color="999999"/>
@@ -9571,7 +9822,7 @@
         </w:tc>
         <w:tc>
           <w:tcPr>
-            <w:tcW w:w="845" w:type="dxa"/>
+            <w:tcW w:w="846" w:type="dxa"/>
             <w:tcBorders>
               <w:top w:val="single" w:sz="2" w:space="0" w:color="999999"/>
               <w:left w:val="single" w:sz="2" w:space="0" w:color="999999"/>
@@ -9602,7 +9853,7 @@
         </w:tc>
         <w:tc>
           <w:tcPr>
-            <w:tcW w:w="1992" w:type="dxa"/>
+            <w:tcW w:w="1991" w:type="dxa"/>
             <w:tcBorders>
               <w:top w:val="single" w:sz="2" w:space="0" w:color="999999"/>
               <w:left w:val="single" w:sz="2" w:space="0" w:color="999999"/>
@@ -9636,7 +9887,7 @@
         <w:trPr/>
         <w:tc>
           <w:tcPr>
-            <w:tcW w:w="1448" w:type="dxa"/>
+            <w:tcW w:w="1447" w:type="dxa"/>
             <w:tcBorders>
               <w:top w:val="single" w:sz="2" w:space="0" w:color="999999"/>
               <w:left w:val="single" w:sz="2" w:space="0" w:color="999999"/>
@@ -9667,7 +9918,7 @@
         </w:tc>
         <w:tc>
           <w:tcPr>
-            <w:tcW w:w="847" w:type="dxa"/>
+            <w:tcW w:w="848" w:type="dxa"/>
             <w:tcBorders>
               <w:top w:val="single" w:sz="2" w:space="0" w:color="999999"/>
               <w:left w:val="single" w:sz="2" w:space="0" w:color="999999"/>
@@ -9853,7 +10104,7 @@
         </w:tc>
         <w:tc>
           <w:tcPr>
-            <w:tcW w:w="845" w:type="dxa"/>
+            <w:tcW w:w="846" w:type="dxa"/>
             <w:tcBorders>
               <w:top w:val="single" w:sz="2" w:space="0" w:color="999999"/>
               <w:left w:val="single" w:sz="2" w:space="0" w:color="999999"/>
@@ -9884,7 +10135,7 @@
         </w:tc>
         <w:tc>
           <w:tcPr>
-            <w:tcW w:w="1992" w:type="dxa"/>
+            <w:tcW w:w="1991" w:type="dxa"/>
             <w:tcBorders>
               <w:top w:val="single" w:sz="2" w:space="0" w:color="999999"/>
               <w:left w:val="single" w:sz="2" w:space="0" w:color="999999"/>
@@ -9918,7 +10169,7 @@
         <w:trPr/>
         <w:tc>
           <w:tcPr>
-            <w:tcW w:w="1448" w:type="dxa"/>
+            <w:tcW w:w="1447" w:type="dxa"/>
             <w:tcBorders>
               <w:top w:val="single" w:sz="2" w:space="0" w:color="999999"/>
               <w:left w:val="single" w:sz="2" w:space="0" w:color="999999"/>
@@ -9949,7 +10200,7 @@
         </w:tc>
         <w:tc>
           <w:tcPr>
-            <w:tcW w:w="847" w:type="dxa"/>
+            <w:tcW w:w="848" w:type="dxa"/>
             <w:tcBorders>
               <w:top w:val="single" w:sz="2" w:space="0" w:color="999999"/>
               <w:left w:val="single" w:sz="2" w:space="0" w:color="999999"/>
@@ -10135,7 +10386,7 @@
         </w:tc>
         <w:tc>
           <w:tcPr>
-            <w:tcW w:w="845" w:type="dxa"/>
+            <w:tcW w:w="846" w:type="dxa"/>
             <w:tcBorders>
               <w:top w:val="single" w:sz="2" w:space="0" w:color="999999"/>
               <w:left w:val="single" w:sz="2" w:space="0" w:color="999999"/>
@@ -10166,7 +10417,7 @@
         </w:tc>
         <w:tc>
           <w:tcPr>
-            <w:tcW w:w="1992" w:type="dxa"/>
+            <w:tcW w:w="1991" w:type="dxa"/>
             <w:tcBorders>
               <w:top w:val="single" w:sz="2" w:space="0" w:color="999999"/>
               <w:left w:val="single" w:sz="2" w:space="0" w:color="999999"/>
@@ -10200,7 +10451,7 @@
         <w:trPr/>
         <w:tc>
           <w:tcPr>
-            <w:tcW w:w="1448" w:type="dxa"/>
+            <w:tcW w:w="1447" w:type="dxa"/>
             <w:tcBorders>
               <w:top w:val="single" w:sz="2" w:space="0" w:color="999999"/>
               <w:left w:val="single" w:sz="2" w:space="0" w:color="999999"/>
@@ -10231,7 +10482,7 @@
         </w:tc>
         <w:tc>
           <w:tcPr>
-            <w:tcW w:w="847" w:type="dxa"/>
+            <w:tcW w:w="848" w:type="dxa"/>
             <w:tcBorders>
               <w:top w:val="single" w:sz="2" w:space="0" w:color="999999"/>
               <w:left w:val="single" w:sz="2" w:space="0" w:color="999999"/>
@@ -10417,7 +10668,7 @@
         </w:tc>
         <w:tc>
           <w:tcPr>
-            <w:tcW w:w="845" w:type="dxa"/>
+            <w:tcW w:w="846" w:type="dxa"/>
             <w:tcBorders>
               <w:top w:val="single" w:sz="2" w:space="0" w:color="999999"/>
               <w:left w:val="single" w:sz="2" w:space="0" w:color="999999"/>
@@ -10448,7 +10699,7 @@
         </w:tc>
         <w:tc>
           <w:tcPr>
-            <w:tcW w:w="1992" w:type="dxa"/>
+            <w:tcW w:w="1991" w:type="dxa"/>
             <w:tcBorders>
               <w:top w:val="single" w:sz="2" w:space="0" w:color="999999"/>
               <w:left w:val="single" w:sz="2" w:space="0" w:color="999999"/>
@@ -10482,7 +10733,7 @@
         <w:trPr/>
         <w:tc>
           <w:tcPr>
-            <w:tcW w:w="1448" w:type="dxa"/>
+            <w:tcW w:w="1447" w:type="dxa"/>
             <w:tcBorders>
               <w:top w:val="single" w:sz="2" w:space="0" w:color="999999"/>
               <w:left w:val="single" w:sz="2" w:space="0" w:color="999999"/>
@@ -10513,7 +10764,7 @@
         </w:tc>
         <w:tc>
           <w:tcPr>
-            <w:tcW w:w="847" w:type="dxa"/>
+            <w:tcW w:w="848" w:type="dxa"/>
             <w:tcBorders>
               <w:top w:val="single" w:sz="2" w:space="0" w:color="999999"/>
               <w:left w:val="single" w:sz="2" w:space="0" w:color="999999"/>
@@ -10699,7 +10950,7 @@
         </w:tc>
         <w:tc>
           <w:tcPr>
-            <w:tcW w:w="845" w:type="dxa"/>
+            <w:tcW w:w="846" w:type="dxa"/>
             <w:tcBorders>
               <w:top w:val="single" w:sz="2" w:space="0" w:color="999999"/>
               <w:left w:val="single" w:sz="2" w:space="0" w:color="999999"/>
@@ -10730,7 +10981,7 @@
         </w:tc>
         <w:tc>
           <w:tcPr>
-            <w:tcW w:w="1992" w:type="dxa"/>
+            <w:tcW w:w="1991" w:type="dxa"/>
             <w:tcBorders>
               <w:top w:val="single" w:sz="2" w:space="0" w:color="999999"/>
               <w:left w:val="single" w:sz="2" w:space="0" w:color="999999"/>
@@ -10857,7 +11108,7 @@
         <w:pStyle w:val="ListParagraph"/>
         <w:numPr>
           <w:ilvl w:val="0"/>
-          <w:numId w:val="3"/>
+          <w:numId w:val="4"/>
         </w:numPr>
         <w:spacing w:before="40" w:after="40"/>
         <w:rPr/>
@@ -10876,7 +11127,7 @@
         <w:pStyle w:val="ListParagraph"/>
         <w:numPr>
           <w:ilvl w:val="0"/>
-          <w:numId w:val="1"/>
+          <w:numId w:val="5"/>
         </w:numPr>
         <w:spacing w:before="40" w:after="40"/>
         <w:rPr/>
@@ -10895,7 +11146,7 @@
         <w:pStyle w:val="ListParagraph"/>
         <w:numPr>
           <w:ilvl w:val="0"/>
-          <w:numId w:val="1"/>
+          <w:numId w:val="6"/>
         </w:numPr>
         <w:spacing w:before="40" w:after="40"/>
         <w:rPr/>
@@ -10942,7 +11193,7 @@
         <w:pStyle w:val="ListParagraph"/>
         <w:numPr>
           <w:ilvl w:val="0"/>
-          <w:numId w:val="1"/>
+          <w:numId w:val="7"/>
         </w:numPr>
         <w:spacing w:before="40" w:after="40"/>
         <w:rPr/>
@@ -10961,7 +11212,7 @@
         <w:pStyle w:val="ListParagraph"/>
         <w:numPr>
           <w:ilvl w:val="0"/>
-          <w:numId w:val="1"/>
+          <w:numId w:val="8"/>
         </w:numPr>
         <w:spacing w:before="40" w:after="40"/>
         <w:rPr/>
@@ -10980,7 +11231,7 @@
         <w:pStyle w:val="ListParagraph"/>
         <w:numPr>
           <w:ilvl w:val="0"/>
-          <w:numId w:val="1"/>
+          <w:numId w:val="9"/>
         </w:numPr>
         <w:spacing w:before="40" w:after="40"/>
         <w:rPr/>
@@ -11027,7 +11278,7 @@
         <w:pStyle w:val="ListParagraph"/>
         <w:numPr>
           <w:ilvl w:val="0"/>
-          <w:numId w:val="1"/>
+          <w:numId w:val="10"/>
         </w:numPr>
         <w:spacing w:before="40" w:after="40"/>
         <w:rPr/>
@@ -11046,7 +11297,7 @@
         <w:pStyle w:val="ListParagraph"/>
         <w:numPr>
           <w:ilvl w:val="0"/>
-          <w:numId w:val="1"/>
+          <w:numId w:val="11"/>
         </w:numPr>
         <w:spacing w:before="40" w:after="40"/>
         <w:rPr/>
@@ -11065,7 +11316,7 @@
         <w:pStyle w:val="ListParagraph"/>
         <w:numPr>
           <w:ilvl w:val="0"/>
-          <w:numId w:val="1"/>
+          <w:numId w:val="12"/>
         </w:numPr>
         <w:spacing w:before="40" w:after="40"/>
         <w:rPr/>
@@ -11084,7 +11335,7 @@
         <w:pStyle w:val="ListParagraph"/>
         <w:numPr>
           <w:ilvl w:val="0"/>
-          <w:numId w:val="1"/>
+          <w:numId w:val="13"/>
         </w:numPr>
         <w:spacing w:before="40" w:after="40"/>
         <w:rPr/>
@@ -11103,7 +11354,7 @@
         <w:pStyle w:val="ListParagraph"/>
         <w:numPr>
           <w:ilvl w:val="0"/>
-          <w:numId w:val="1"/>
+          <w:numId w:val="14"/>
         </w:numPr>
         <w:spacing w:before="40" w:after="40"/>
         <w:rPr/>
@@ -11122,7 +11373,7 @@
         <w:pStyle w:val="ListParagraph"/>
         <w:numPr>
           <w:ilvl w:val="0"/>
-          <w:numId w:val="1"/>
+          <w:numId w:val="15"/>
         </w:numPr>
         <w:spacing w:before="40" w:after="40"/>
         <w:rPr/>
@@ -12324,6 +12575,7 @@
         </w:tabs>
         <w:ind w:left="1080" w:hanging="360"/>
       </w:pPr>
+      <w:rPr/>
     </w:lvl>
     <w:lvl w:ilvl="2">
       <w:start w:val="1"/>
@@ -12336,6 +12588,7 @@
         </w:tabs>
         <w:ind w:left="1440" w:hanging="360"/>
       </w:pPr>
+      <w:rPr/>
     </w:lvl>
     <w:lvl w:ilvl="3">
       <w:start w:val="1"/>
@@ -12348,6 +12601,7 @@
         </w:tabs>
         <w:ind w:left="1800" w:hanging="360"/>
       </w:pPr>
+      <w:rPr/>
     </w:lvl>
     <w:lvl w:ilvl="4">
       <w:start w:val="1"/>
@@ -12360,6 +12614,7 @@
         </w:tabs>
         <w:ind w:left="2160" w:hanging="360"/>
       </w:pPr>
+      <w:rPr/>
     </w:lvl>
     <w:lvl w:ilvl="5">
       <w:start w:val="1"/>
@@ -12372,6 +12627,7 @@
         </w:tabs>
         <w:ind w:left="2520" w:hanging="360"/>
       </w:pPr>
+      <w:rPr/>
     </w:lvl>
     <w:lvl w:ilvl="6">
       <w:start w:val="1"/>
@@ -12384,6 +12640,7 @@
         </w:tabs>
         <w:ind w:left="2880" w:hanging="360"/>
       </w:pPr>
+      <w:rPr/>
     </w:lvl>
     <w:lvl w:ilvl="7">
       <w:start w:val="1"/>
@@ -12396,6 +12653,7 @@
         </w:tabs>
         <w:ind w:left="3240" w:hanging="360"/>
       </w:pPr>
+      <w:rPr/>
     </w:lvl>
     <w:lvl w:ilvl="8">
       <w:start w:val="1"/>
@@ -12408,9 +12666,131 @@
         </w:tabs>
         <w:ind w:left="3600" w:hanging="360"/>
       </w:pPr>
+      <w:rPr/>
     </w:lvl>
   </w:abstractNum>
   <w:abstractNum w:abstractNumId="2">
+    <w:lvl w:ilvl="0">
+      <w:start w:val="1"/>
+      <w:numFmt w:val="bullet"/>
+      <w:lvlText w:val=""/>
+      <w:lvlJc w:val="left"/>
+      <w:pPr>
+        <w:tabs>
+          <w:tab w:val="num" w:pos="0"/>
+        </w:tabs>
+        <w:ind w:left="720" w:hanging="360"/>
+      </w:pPr>
+      <w:rPr>
+        <w:rFonts w:ascii="Symbol" w:hAnsi="Symbol" w:cs="Symbol" w:hint="default"/>
+      </w:rPr>
+    </w:lvl>
+    <w:lvl w:ilvl="1">
+      <w:start w:val="1"/>
+      <w:numFmt w:val="decimal"/>
+      <w:lvlText w:val="%2."/>
+      <w:lvlJc w:val="left"/>
+      <w:pPr>
+        <w:tabs>
+          <w:tab w:val="num" w:pos="1080"/>
+        </w:tabs>
+        <w:ind w:left="1080" w:hanging="360"/>
+      </w:pPr>
+      <w:rPr/>
+    </w:lvl>
+    <w:lvl w:ilvl="2">
+      <w:start w:val="1"/>
+      <w:numFmt w:val="decimal"/>
+      <w:lvlText w:val="%3."/>
+      <w:lvlJc w:val="left"/>
+      <w:pPr>
+        <w:tabs>
+          <w:tab w:val="num" w:pos="1440"/>
+        </w:tabs>
+        <w:ind w:left="1440" w:hanging="360"/>
+      </w:pPr>
+      <w:rPr/>
+    </w:lvl>
+    <w:lvl w:ilvl="3">
+      <w:start w:val="1"/>
+      <w:numFmt w:val="decimal"/>
+      <w:lvlText w:val="%4."/>
+      <w:lvlJc w:val="left"/>
+      <w:pPr>
+        <w:tabs>
+          <w:tab w:val="num" w:pos="1800"/>
+        </w:tabs>
+        <w:ind w:left="1800" w:hanging="360"/>
+      </w:pPr>
+      <w:rPr/>
+    </w:lvl>
+    <w:lvl w:ilvl="4">
+      <w:start w:val="1"/>
+      <w:numFmt w:val="decimal"/>
+      <w:lvlText w:val="%5."/>
+      <w:lvlJc w:val="left"/>
+      <w:pPr>
+        <w:tabs>
+          <w:tab w:val="num" w:pos="2160"/>
+        </w:tabs>
+        <w:ind w:left="2160" w:hanging="360"/>
+      </w:pPr>
+      <w:rPr/>
+    </w:lvl>
+    <w:lvl w:ilvl="5">
+      <w:start w:val="1"/>
+      <w:numFmt w:val="decimal"/>
+      <w:lvlText w:val="%6."/>
+      <w:lvlJc w:val="left"/>
+      <w:pPr>
+        <w:tabs>
+          <w:tab w:val="num" w:pos="2520"/>
+        </w:tabs>
+        <w:ind w:left="2520" w:hanging="360"/>
+      </w:pPr>
+      <w:rPr/>
+    </w:lvl>
+    <w:lvl w:ilvl="6">
+      <w:start w:val="1"/>
+      <w:numFmt w:val="decimal"/>
+      <w:lvlText w:val="%7."/>
+      <w:lvlJc w:val="left"/>
+      <w:pPr>
+        <w:tabs>
+          <w:tab w:val="num" w:pos="2880"/>
+        </w:tabs>
+        <w:ind w:left="2880" w:hanging="360"/>
+      </w:pPr>
+      <w:rPr/>
+    </w:lvl>
+    <w:lvl w:ilvl="7">
+      <w:start w:val="1"/>
+      <w:numFmt w:val="decimal"/>
+      <w:lvlText w:val="%8."/>
+      <w:lvlJc w:val="left"/>
+      <w:pPr>
+        <w:tabs>
+          <w:tab w:val="num" w:pos="3240"/>
+        </w:tabs>
+        <w:ind w:left="3240" w:hanging="360"/>
+      </w:pPr>
+      <w:rPr/>
+    </w:lvl>
+    <w:lvl w:ilvl="8">
+      <w:start w:val="1"/>
+      <w:numFmt w:val="decimal"/>
+      <w:lvlText w:val="%9."/>
+      <w:lvlJc w:val="left"/>
+      <w:pPr>
+        <w:tabs>
+          <w:tab w:val="num" w:pos="3600"/>
+        </w:tabs>
+        <w:ind w:left="3600" w:hanging="360"/>
+      </w:pPr>
+      <w:rPr/>
+    </w:lvl>
+  </w:abstractNum>
+  <w:abstractNum w:abstractNumId="3">
     <w:lvl w:ilvl="0">
       <w:start w:val="1"/>
       <w:numFmt w:val="none"/>
@@ -12536,10 +12916,46 @@
     <w:abstractNumId w:val="2"/>
   </w:num>
   <w:num w:numId="3">
-    <w:abstractNumId w:val="1"/>
+    <w:abstractNumId w:val="3"/>
+  </w:num>
+  <w:num w:numId="4">
+    <w:abstractNumId w:val="2"/>
     <w:lvlOverride w:ilvl="0">
       <w:startOverride w:val="1"/>
     </w:lvlOverride>
+  </w:num>
+  <w:num w:numId="5">
+    <w:abstractNumId w:val="2"/>
+  </w:num>
+  <w:num w:numId="6">
+    <w:abstractNumId w:val="2"/>
+  </w:num>
+  <w:num w:numId="7">
+    <w:abstractNumId w:val="2"/>
+  </w:num>
+  <w:num w:numId="8">
+    <w:abstractNumId w:val="2"/>
+  </w:num>
+  <w:num w:numId="9">
+    <w:abstractNumId w:val="2"/>
+  </w:num>
+  <w:num w:numId="10">
+    <w:abstractNumId w:val="2"/>
+  </w:num>
+  <w:num w:numId="11">
+    <w:abstractNumId w:val="2"/>
+  </w:num>
+  <w:num w:numId="12">
+    <w:abstractNumId w:val="2"/>
+  </w:num>
+  <w:num w:numId="13">
+    <w:abstractNumId w:val="2"/>
+  </w:num>
+  <w:num w:numId="14">
+    <w:abstractNumId w:val="2"/>
+  </w:num>
+  <w:num w:numId="15">
+    <w:abstractNumId w:val="2"/>
   </w:num>
 </w:numbering>
 </file>
@@ -12564,6 +12980,7 @@
     <w:qFormat/>
     <w:pPr>
       <w:widowControl/>
+      <w:suppressAutoHyphens w:val="true"/>
       <w:bidi w:val="0"/>
       <w:spacing w:before="0" w:after="0"/>
       <w:jc w:val="left"/>
@@ -12787,6 +13204,7 @@
     <w:qFormat/>
     <w:pPr>
       <w:widowControl/>
+      <w:suppressAutoHyphens w:val="true"/>
       <w:bidi w:val="0"/>
       <w:spacing w:before="0" w:after="0"/>
       <w:jc w:val="left"/>
@@ -12807,6 +13225,7 @@
     <w:qFormat/>
     <w:pPr>
       <w:widowControl/>
+      <w:suppressAutoHyphens w:val="true"/>
       <w:bidi w:val="0"/>
       <w:spacing w:before="0" w:after="0"/>
       <w:jc w:val="left"/>

</xml_diff>